<commit_message>
Protocol/eCRF's afgestemd op de nieuwe internationale Core Outcome Set en Core Descriptor Set (Staniszewska et al., Diabetes Care 2024 / Diabetologia 2026): - 4 ontbrekende COS-eindpunten toegevoegd aan §3.2.3: infectie (PEDIS/WIfI), majeure amputatie, mineure amputatie, mortaliteit - met correcte bronvermelding - 4 ontbrekende CDS-baselinekenmerken toegevoegd aan eCRF-document 07: hartaandoening, eGFR, CKD-stadium (KDIGO), actuele diabetesmedicatie (insuline/orale/niet-insuline injectables) - Beide referenties toegevoegd aan §12 (was volledig leeg) en aan de betrokken paragrafen - Doc 12 (tevredenheid ulcuspreventie, VAS) wordt voortaan ook op V8 (18 maand) afgenomen naast baseline, om verandering te meten; protocol §5.5.2/5.5.5 en protocol-analyse.html bijgewerkt, doc 12 ook geplaatst bij V8
</commit_message>
<xml_diff>
--- a/(e)CRF/Per nummer/07_Demografische gegevens en medische voorgeschiedenis.docx
+++ b/(e)CRF/Per nummer/07_Demografische gegevens en medische voorgeschiedenis.docx
@@ -2665,6 +2665,98 @@
                 <w:szCs w:val="24"/>
               </w:rPr>
             </w:pPr>
+          </w:p>
+        </w:tc>
+      </w:tr>
+      <w:tr>
+        <w:tc>
+          <w:tcPr>
+            <w:tcW w:type="dxa" w:w="3969"/>
+          </w:tcPr>
+          <w:p>
+            <w:r>
+              <w:t xml:space="preserve">     2.20 Hartaandoening (bv. hartfalen, coronaire hartziekte)</w:t>
+            </w:r>
+          </w:p>
+        </w:tc>
+        <w:tc>
+          <w:tcPr>
+            <w:tcW w:type="dxa" w:w="4989"/>
+          </w:tcPr>
+          <w:p>
+            <w:r>
+              <w:t>Ja/Nee</w:t>
+            </w:r>
+          </w:p>
+        </w:tc>
+      </w:tr>
+      <w:tr>
+        <w:tc>
+          <w:tcPr>
+            <w:tcW w:type="dxa" w:w="3969"/>
+          </w:tcPr>
+          <w:p>
+            <w:r>
+              <w:t xml:space="preserve">     2.21 Nierfunctie: eGFR (meest recente waarde)</w:t>
+            </w:r>
+          </w:p>
+        </w:tc>
+        <w:tc>
+          <w:tcPr>
+            <w:tcW w:type="dxa" w:w="4989"/>
+          </w:tcPr>
+          <w:p>
+            <w:r>
+              <w:t>eGFR: ______ mL/min/1,73m²   Datum: ___/___/______</w:t>
+            </w:r>
+          </w:p>
+        </w:tc>
+      </w:tr>
+      <w:tr>
+        <w:tc>
+          <w:tcPr>
+            <w:tcW w:type="dxa" w:w="3969"/>
+          </w:tcPr>
+          <w:p>
+            <w:r>
+              <w:t xml:space="preserve">     2.22 CKD-stadium (KDIGO, indien gekend)</w:t>
+            </w:r>
+          </w:p>
+        </w:tc>
+        <w:tc>
+          <w:tcPr>
+            <w:tcW w:type="dxa" w:w="4989"/>
+          </w:tcPr>
+          <w:p>
+            <w:r>
+              <w:t>G1 / G2 / G3a / G3b / G4 / G5 / onbekend</w:t>
+            </w:r>
+          </w:p>
+        </w:tc>
+      </w:tr>
+      <w:tr>
+        <w:tc>
+          <w:tcPr>
+            <w:tcW w:type="dxa" w:w="3969"/>
+          </w:tcPr>
+          <w:p>
+            <w:r>
+              <w:t xml:space="preserve">     2.23 Huidige diabetesmedicatie</w:t>
+            </w:r>
+          </w:p>
+        </w:tc>
+        <w:tc>
+          <w:tcPr>
+            <w:tcW w:type="dxa" w:w="4989"/>
+          </w:tcPr>
+          <w:p>
+            <w:r>
+              <w:t>Insuline: Ja/Nee</w:t>
+              <w:br/>
+              <w:t>Orale glucoseverlagende medicatie: Ja/Nee — welke: __________</w:t>
+              <w:br/>
+              <w:t>Niet-insuline injectables (bv. GLP-1-agonist): Ja/Nee — welke: __________</w:t>
+            </w:r>
           </w:p>
         </w:tc>
       </w:tr>

</xml_diff>

<commit_message>
eCRF 07: verdere aanvulling na volledige CDS-doorlichting (alle 28 descriptoren nagekeken)
- 2.4 Rookstatus uitgebreid van louter "huidige status" naar volledige rookgeschiedenis
  (Nooit gerookt/Ex-roker/Huidige roker) - CDS vraagt expliciet "history of smoking",
  niet enkel de huidige status
- 2.18 Voorgeschiedenis ulcus ingevuld met de kenmerken van het kwalificerende ulcus
  (locatie, datum ontstaan/genezing -> duur, grootte, diepte, osteomyelitis,
  wekedeleninfectie/cellulitis) - dit veld stond nog volledig leeg en dekt nu het
  CDS-domein "ulcer characteristics" (6/6 descriptoren)
- Nieuw 2.24 Huidig gebruik van antibiotica toegevoegd - laatste ontbrekende
  CDS-descriptor uit domein "ongoing medical interventions"
</commit_message>
<xml_diff>
--- a/(e)CRF/Per nummer/07_Demografische gegevens en medische voorgeschiedenis.docx
+++ b/(e)CRF/Per nummer/07_Demografische gegevens en medische voorgeschiedenis.docx
@@ -1284,20 +1284,8 @@
             <w:tcW w:w="3969" w:type="dxa"/>
           </w:tcPr>
           <w:p>
-            <w:pPr>
-              <w:spacing w:line="360" w:lineRule="auto"/>
-              <w:rPr>
-                <w:sz w:val="24"/>
-                <w:szCs w:val="24"/>
-              </w:rPr>
-            </w:pPr>
-            <w:r>
-              <w:rPr>
-                <w:color w:val="24303B"/>
-                <w:sz w:val="24"/>
-                <w:szCs w:val="24"/>
-              </w:rPr>
-              <w:t xml:space="preserve">     2.4 Huidige rookstatus</w:t>
+            <w:r>
+              <w:t xml:space="preserve">     2.4 Rookstatus (voorgeschiedenis)</w:t>
             </w:r>
           </w:p>
         </w:tc>
@@ -1306,13 +1294,9 @@
             <w:tcW w:w="4989" w:type="dxa"/>
           </w:tcPr>
           <w:p>
-            <w:pPr>
-              <w:spacing w:line="360" w:lineRule="auto"/>
-              <w:rPr>
-                <w:sz w:val="24"/>
-                <w:szCs w:val="24"/>
-              </w:rPr>
-            </w:pPr>
+            <w:r>
+              <w:t>Nooit gerookt / Ex-roker / Huidige roker</w:t>
+            </w:r>
           </w:p>
         </w:tc>
       </w:tr>
@@ -1322,20 +1306,8 @@
             <w:tcW w:w="3969" w:type="dxa"/>
           </w:tcPr>
           <w:p>
-            <w:pPr>
-              <w:spacing w:line="360" w:lineRule="auto"/>
-              <w:rPr>
-                <w:sz w:val="24"/>
-                <w:szCs w:val="24"/>
-              </w:rPr>
-            </w:pPr>
-            <w:r>
-              <w:rPr>
-                <w:color w:val="24303B"/>
-                <w:sz w:val="24"/>
-                <w:szCs w:val="24"/>
-              </w:rPr>
-              <w:t xml:space="preserve">     2.5 Aantal sigaretten per dag</w:t>
+            <w:r>
+              <w:t xml:space="preserve">     2.5 Aantal sigaretten per dag (huidige rokers) / aantal jaren gestopt (ex-rokers)</w:t>
             </w:r>
           </w:p>
         </w:tc>
@@ -2554,79 +2526,21 @@
             <w:tcW w:w="4989" w:type="dxa"/>
           </w:tcPr>
           <w:p>
-            <w:pPr>
-              <w:spacing w:line="360" w:lineRule="auto"/>
-              <w:rPr>
-                <w:sz w:val="24"/>
-                <w:szCs w:val="24"/>
-              </w:rPr>
-            </w:pPr>
-            <w:r>
-              <w:rPr>
-                <w:noProof/>
-                <w:color w:val="24303B"/>
-                <w:sz w:val="24"/>
-                <w:szCs w:val="24"/>
-              </w:rPr>
-              <w:drawing>
-                <wp:inline distT="0" distB="0" distL="0" distR="0" wp14:anchorId="76B67501" wp14:editId="50B39775">
-                  <wp:extent cx="2615758" cy="2032000"/>
-                  <wp:effectExtent l="0" t="0" r="0" b="6350"/>
-                  <wp:docPr id="1664634879" name="Picture 4">
-                    <a:extLst xmlns:a="http://schemas.openxmlformats.org/drawingml/2006/main">
-                      <a:ext uri="{FF2B5EF4-FFF2-40B4-BE49-F238E27FC236}">
-                        <a16:creationId xmlns:a16="http://schemas.microsoft.com/office/drawing/2014/main" id="{848387B9-AC5C-4151-DEDF-C5485E252E46}"/>
-                      </a:ext>
-                    </a:extLst>
-                  </wp:docPr>
-                  <wp:cNvGraphicFramePr>
-                    <a:graphicFrameLocks xmlns:a="http://schemas.openxmlformats.org/drawingml/2006/main" noChangeAspect="1"/>
-                  </wp:cNvGraphicFramePr>
-                  <a:graphic xmlns:a="http://schemas.openxmlformats.org/drawingml/2006/main">
-                    <a:graphicData uri="http://schemas.openxmlformats.org/drawingml/2006/picture">
-                      <pic:pic xmlns:pic="http://schemas.openxmlformats.org/drawingml/2006/picture">
-                        <pic:nvPicPr>
-                          <pic:cNvPr id="5" name="Picture 4">
-                            <a:extLst>
-                              <a:ext uri="{FF2B5EF4-FFF2-40B4-BE49-F238E27FC236}">
-                                <a16:creationId xmlns:a16="http://schemas.microsoft.com/office/drawing/2014/main" id="{848387B9-AC5C-4151-DEDF-C5485E252E46}"/>
-                              </a:ext>
-                            </a:extLst>
-                          </pic:cNvPr>
-                          <pic:cNvPicPr>
-                            <a:picLocks noChangeAspect="1"/>
-                          </pic:cNvPicPr>
-                        </pic:nvPicPr>
-                        <pic:blipFill>
-                          <a:blip r:embed="rId10"/>
-                          <a:stretch>
-                            <a:fillRect/>
-                          </a:stretch>
-                        </pic:blipFill>
-                        <pic:spPr>
-                          <a:xfrm>
-                            <a:off x="0" y="0"/>
-                            <a:ext cx="2636089" cy="2047793"/>
-                          </a:xfrm>
-                          <a:prstGeom prst="rect">
-                            <a:avLst/>
-                          </a:prstGeom>
-                        </pic:spPr>
-                      </pic:pic>
-                    </a:graphicData>
-                  </a:graphic>
-                </wp:inline>
-              </w:drawing>
-            </w:r>
-          </w:p>
-          <w:p>
-            <w:pPr>
-              <w:spacing w:line="360" w:lineRule="auto"/>
-              <w:rPr>
-                <w:sz w:val="24"/>
-                <w:szCs w:val="24"/>
-              </w:rPr>
-            </w:pPr>
+            <w:r>
+              <w:t>Kwalificerend ulcus (meest recente genezen ulcus vóór inclusie, zie ook eCRF-document 06):</w:t>
+              <w:br/>
+              <w:t>Locatie: __________</w:t>
+              <w:br/>
+              <w:t>Datum ontstaan: ___/___/______   Datum genezing: ___/___/______</w:t>
+              <w:br/>
+              <w:t>Grootste afmeting bij diagnose (cm², indien gekend): ______</w:t>
+              <w:br/>
+              <w:t>Diepte: Oppervlakkig (huid) / Tot pees of kapsel / Tot bot of gewricht / Onbekend</w:t>
+              <w:br/>
+              <w:t>Osteomyelitis vastgesteld: Ja/Nee/Onbekend</w:t>
+              <w:br/>
+              <w:t>Wekedeleninfectie/cellulitis vastgesteld: Ja/Nee/Onbekend</w:t>
+            </w:r>
           </w:p>
         </w:tc>
       </w:tr>
@@ -2756,6 +2670,28 @@
               <w:t>Orale glucoseverlagende medicatie: Ja/Nee — welke: __________</w:t>
               <w:br/>
               <w:t>Niet-insuline injectables (bv. GLP-1-agonist): Ja/Nee — welke: __________</w:t>
+            </w:r>
+          </w:p>
+        </w:tc>
+      </w:tr>
+      <w:tr>
+        <w:tc>
+          <w:tcPr>
+            <w:tcW w:type="dxa" w:w="3969"/>
+          </w:tcPr>
+          <w:p>
+            <w:r>
+              <w:t xml:space="preserve">     2.24 Huidig gebruik van antibiotica</w:t>
+            </w:r>
+          </w:p>
+        </w:tc>
+        <w:tc>
+          <w:tcPr>
+            <w:tcW w:type="dxa" w:w="4989"/>
+          </w:tcPr>
+          <w:p>
+            <w:r>
+              <w:t>Ja/Nee — zo ja, welke en sinds wanneer: __________</w:t>
             </w:r>
           </w:p>
         </w:tc>

</xml_diff>